<commit_message>
Kalender en beschikbaarheidsoverzicht: SEBIA volgens agenda Dobbels, UZA alleen donderdag in even weken
Co-Authored-By: Claude Opus 5.5 <noreply@anthropic.com>
</commit_message>
<xml_diff>
--- a/PARADISE_beschikbaarheid.docx
+++ b/PARADISE_beschikbaarheid.docx
@@ -56,7 +56,7 @@
           <w:color w:val="5A6A78"/>
           <w:sz w:val="17"/>
         </w:rPr>
-        <w:t>Bronnen: het blad Podoloog in Executive Board Composition.xlsx (wat de centra zelf opgaven), de agenda van Fabienne Dobbels in de SEBIA-deck van 23 september (dia 12), en de afspraak dat UZ Antwerpen alleen in even weken werkt. VM = voormiddag, NM = namiddag. Een halve dag met verplaatsing telt als een volle dag.</w:t>
+        <w:t>Bronnen: het blad Podoloog in Executive Board Composition.xlsx (wat de centra zelf opgaven), de agenda van Fabienne Dobbels in de SEBIA-deck van 23 september (dia 12), en de afspraak dat UZ Antwerpen op donderdag alleen in even weken werkt; dinsdag en woensdag elke week. VM = voormiddag, NM = namiddag. Een halve dag met verplaatsing telt als een volle dag.</w:t>
       </w:r>
     </w:p>
     <w:p>
@@ -1291,7 +1291,7 @@
                 <w:color w:val="1B2630"/>
                 <w:sz w:val="17"/>
               </w:rPr>
-              <w:t>UZ Antwerpen, even weken</w:t>
+              <w:t>UZ Antwerpen</w:t>
             </w:r>
           </w:p>
         </w:tc>
@@ -1434,7 +1434,7 @@
                 <w:color w:val="1B2630"/>
                 <w:sz w:val="17"/>
               </w:rPr>
-              <w:t>vrij</w:t>
+              <w:t>vrij, even week</w:t>
             </w:r>
           </w:p>
         </w:tc>
@@ -2417,7 +2417,7 @@
                 <w:color w:val="1B2630"/>
                 <w:sz w:val="17"/>
               </w:rPr>
-              <w:t>ma, vr; en oneven weken</w:t>
+              <w:t>ma, vr; do in oneven weken</w:t>
             </w:r>
           </w:p>
         </w:tc>
@@ -2625,7 +2625,7 @@
           <w:color w:val="1B2630"/>
           <w:sz w:val="19"/>
         </w:rPr>
-        <w:t xml:space="preserve">  het enige gemeenschappelijke moment is dinsdag, voor- of namiddag, in een even week.</w:t>
+        <w:t xml:space="preserve">  het enige gemeenschappelijke moment is dinsdag, voor- of namiddag, elke week.</w:t>
       </w:r>
     </w:p>
     <w:p>
@@ -2691,7 +2691,7 @@
           <w:color w:val="1B2630"/>
           <w:sz w:val="19"/>
         </w:rPr>
-        <w:t xml:space="preserve">  live voor Leuven, Antwerpen (even week), Aalst en de tweede podoloog van Brugge. Kortrijk heeft dan voetkliniek en Gent kan op dinsdag nooit: zij bekijken de opname.</w:t>
+        <w:t xml:space="preserve">  live voor Leuven, Antwerpen, Aalst en de tweede podoloog van Brugge. Kortrijk heeft dan voetkliniek en Gent kan op dinsdag nooit: zij bekijken de opname.</w:t>
       </w:r>
     </w:p>
     <w:p>
@@ -3207,7 +3207,7 @@
           <w:color w:val="5A6A78"/>
           <w:sz w:val="17"/>
         </w:rPr>
-        <w:t>Per datum in de agenda van Dobbels: kan groep Oost overdag (dinsdag in een even week), en wat kan groep West.</w:t>
+        <w:t>Per datum in de agenda van Dobbels: kan groep Oost overdag (dinsdag), en wat kan groep West.</w:t>
       </w:r>
     </w:p>
     <w:tbl>
@@ -3687,6 +3687,7 @@
         <w:tc>
           <w:tcPr>
             <w:tcW w:type="dxa" w:w="1900"/>
+            <w:shd w:val="clear" w:color="auto" w:fill="D6ECF6"/>
           </w:tcPr>
           <w:p>
             <w:pPr>
@@ -3700,7 +3701,7 @@
                 <w:color w:val="1B2630"/>
                 <w:sz w:val="17"/>
               </w:rPr>
-              <w:t>nee: oneven week</w:t>
+              <w:t>ja</w:t>
             </w:r>
           </w:p>
         </w:tc>
@@ -4184,6 +4185,7 @@
         <w:tc>
           <w:tcPr>
             <w:tcW w:type="dxa" w:w="1900"/>
+            <w:shd w:val="clear" w:color="auto" w:fill="D6ECF6"/>
           </w:tcPr>
           <w:p>
             <w:pPr>
@@ -4197,7 +4199,7 @@
                 <w:color w:val="1B2630"/>
                 <w:sz w:val="17"/>
               </w:rPr>
-              <w:t>nee: oneven week</w:t>
+              <w:t>ja</w:t>
             </w:r>
           </w:p>
         </w:tc>
@@ -4348,6 +4350,7 @@
         <w:tc>
           <w:tcPr>
             <w:tcW w:type="dxa" w:w="1900"/>
+            <w:shd w:val="clear" w:color="auto" w:fill="FFE3C7"/>
           </w:tcPr>
           <w:p>
             <w:pPr>
@@ -4361,6 +4364,7 @@
                 <w:color w:val="1B2630"/>
                 <w:sz w:val="17"/>
               </w:rPr>
+              <w:t>West, optie A (avond)</w:t>
             </w:r>
           </w:p>
         </w:tc>
@@ -4473,7 +4477,6 @@
         <w:tc>
           <w:tcPr>
             <w:tcW w:type="dxa" w:w="1900"/>
-            <w:shd w:val="clear" w:color="auto" w:fill="FFE3C7"/>
           </w:tcPr>
           <w:p>
             <w:pPr>
@@ -4487,7 +4490,6 @@
                 <w:color w:val="1B2630"/>
                 <w:sz w:val="17"/>
               </w:rPr>
-              <w:t>West, optie A (avond)</w:t>
             </w:r>
           </w:p>
         </w:tc>
@@ -4600,7 +4602,6 @@
         <w:tc>
           <w:tcPr>
             <w:tcW w:type="dxa" w:w="1900"/>
-            <w:shd w:val="clear" w:color="auto" w:fill="FFE3C7"/>
           </w:tcPr>
           <w:p>
             <w:pPr>
@@ -4614,7 +4615,6 @@
                 <w:color w:val="1B2630"/>
                 <w:sz w:val="17"/>
               </w:rPr>
-              <w:t>West, optie B</w:t>
             </w:r>
           </w:p>
         </w:tc>
@@ -4726,6 +4726,7 @@
         <w:tc>
           <w:tcPr>
             <w:tcW w:type="dxa" w:w="1900"/>
+            <w:shd w:val="clear" w:color="auto" w:fill="FFE3C7"/>
           </w:tcPr>
           <w:p>
             <w:pPr>
@@ -4739,6 +4740,7 @@
                 <w:color w:val="1B2630"/>
                 <w:sz w:val="17"/>
               </w:rPr>
+              <w:t>West, optie B (avond)</w:t>
             </w:r>
           </w:p>
         </w:tc>
@@ -5135,7 +5137,7 @@
           <w:color w:val="1B2630"/>
           <w:sz w:val="17"/>
         </w:rPr>
-        <w:t>Dinsdag 12 januari is de enige datum van Dobbels waarop groep Oost overdag kan. Beide opties van groep West, 7 en 8 januari, vallen op dagen die Dobbels alleen "indien nodig" opgaf. Een avond op een gewone dag, zoals maandag 11 januari, is een mogelijk alternatief; dat is een voorstel, nog niet getoetst.</w:t>
+        <w:t>De agenda van Dobbels is leidend: zij geeft SEBIA. Groep Oost kan overdag op elke dinsdag in haar agenda (15 december, 5 en 12 januari); de planning neemt 12 januari. Groep West kan alleen 's avonds, of op vrijdagnamiddag met vrijaf. Vóór de eerste droogloop van West, op 13 januari, heeft Dobbels in januari geen gewone vrijdag. Daarom twee avonden op gewone dagen: wo 6 januari (A) en ma 11 januari (B). De dagen die ze alleen indien nodig opgaf, 17 december en 7 en 8 januari, gebruikt de planning niet.</w:t>
       </w:r>
     </w:p>
     <w:p>
@@ -5174,7 +5176,7 @@
           <w:color w:val="5A6A78"/>
           <w:sz w:val="17"/>
         </w:rPr>
-        <w:t>UZ Antwerpen werkt alleen in even weken. Let op: 2026 heeft 53 weken, dus week 53 en week 1 zijn allebei oneven.</w:t>
+        <w:t>UZ Antwerpen werkt op donderdag alleen in even weken; dinsdag en woensdag elke week. Let op: 2026 heeft 53 weken, dus week 53 en week 1 zijn allebei oneven.</w:t>
       </w:r>
     </w:p>
     <w:tbl>
@@ -5266,7 +5268,7 @@
                 <w:color w:val="FFFFFF"/>
                 <w:sz w:val="15"/>
               </w:rPr>
-              <w:t>UZ Antwerpen</w:t>
+              <w:t>UZ Antwerpen op donderdag</w:t>
             </w:r>
           </w:p>
         </w:tc>
@@ -7719,7 +7721,7 @@
                 <w:color w:val="1B2630"/>
                 <w:sz w:val="17"/>
               </w:rPr>
-              <w:t>UZ Antwerpen: bedoelen ze de weeknummers (even week) of werken ze strikt om de week?</w:t>
+              <w:t>UZ Antwerpen: telt de donderdag volgens het weeknummer, of strikt om de week?</w:t>
             </w:r>
           </w:p>
         </w:tc>
@@ -7739,7 +7741,7 @@
                 <w:color w:val="1B2630"/>
                 <w:sz w:val="17"/>
               </w:rPr>
-              <w:t>Door week 53 verschuift een ritme van om de week in januari. Dan vallen alle UZA-data van 2027 (12, 27 en 28 jan, 9 en 23 mrt) in hun vrije week.</w:t>
+              <w:t>Door week 53 verschuift een ritme van om de week in januari. Dan valt het inhaalslot van do 28 jan in hun vrije week. Dinsdag en woensdag gelden elke week.</w:t>
             </w:r>
           </w:p>
         </w:tc>
@@ -7979,7 +7981,7 @@
                 <w:color w:val="1B2630"/>
                 <w:sz w:val="17"/>
               </w:rPr>
-              <w:t>Dobbels: bevestigen van 7 of 8 januari voor groep West</w:t>
+              <w:t>Dobbels: bevestigen van wo 6 (A) of ma 11 januari (B) 's avonds voor groep West, en di 12 januari voor groep Oost</w:t>
             </w:r>
           </w:p>
         </w:tc>
@@ -7999,7 +8001,7 @@
                 <w:color w:val="1B2630"/>
                 <w:sz w:val="17"/>
               </w:rPr>
-              <w:t>Beide staan in haar agenda als "indien nodig".</w:t>
+              <w:t>Alle drie gewone dagen in haar agenda.</w:t>
             </w:r>
           </w:p>
         </w:tc>
@@ -8024,7 +8026,7 @@
                 <w:color w:val="1B2630"/>
                 <w:sz w:val="17"/>
               </w:rPr>
-              <w:t>vóór SEBIA 3</w:t>
+              <w:t>oktober</w:t>
             </w:r>
           </w:p>
         </w:tc>
@@ -8044,7 +8046,7 @@
                 <w:color w:val="1B2630"/>
                 <w:sz w:val="17"/>
               </w:rPr>
-              <w:t>Dobbels: data voor SEBIA 3 en 4 (voorstel 4 en 9 maart), SEBIA 5 per centrum en SEBIA 6</w:t>
+              <w:t>Dobbels: haar agenda voor eind februari en maart, voor SEBIA 3 en 4 (voorstel 4 en 9 maart), SEBIA 5 per centrum en SEBIA 6</w:t>
             </w:r>
           </w:p>
         </w:tc>
@@ -8064,7 +8066,7 @@
                 <w:color w:val="1B2630"/>
                 <w:sz w:val="17"/>
               </w:rPr>
-              <w:t>Nog geen data in haar agenda na januari.</w:t>
+              <w:t>Zij is de lesgever; na januari gaf ze nog geen data. Eerst haar data, dan de centra.</w:t>
             </w:r>
           </w:p>
         </w:tc>

</xml_diff>